<commit_message>
Refactor requirement generation and task allocation skills
- Updated documentation and skill definitions to reflect changes in tool names and purposes.
- Renamed `requirement_generation_skill` to `requirement_generation-skill` for consistency.
- Enhanced the `requirement_generation` skill to include new tools for generating structured client call notes and retrieving module details.
- Modified the `task_generation_and_allocation` skill to streamline tool usage and improve clarity on task assignment processes.
- Added new sections for handling client call notes and clarified the workflow for resolving project IDs and modules.
- Ensured all tool calls are accurately documented and emphasized the importance of confirming project details before execution.
</commit_message>
<xml_diff>
--- a/skills/Client_Call_Update_Generation/Documentation.docx
+++ b/skills/Client_Call_Update_Generation/Documentation.docx
@@ -8,8 +8,8 @@
         <w:jc w:val="center"/>
         <w:rPr>
           <w:rFonts w:ascii="Times New Roman" w:hAnsi="Times New Roman" w:cs="Times New Roman"/>
-          <w:b/>
-          <w:bCs/>
+          <w:b w:val="1"/>
+          <w:bCs w:val="1"/>
           <w:sz w:val="32"/>
           <w:szCs w:val="32"/>
         </w:rPr>
@@ -17,8 +17,8 @@
       <w:r>
         <w:rPr>
           <w:rFonts w:ascii="Times New Roman" w:hAnsi="Times New Roman" w:cs="Times New Roman"/>
-          <w:b/>
-          <w:bCs/>
+          <w:b w:val="1"/>
+          <w:bCs w:val="1"/>
           <w:sz w:val="32"/>
           <w:szCs w:val="32"/>
         </w:rPr>
@@ -27,8 +27,8 @@
       <w:r>
         <w:rPr>
           <w:rFonts w:ascii="Times New Roman" w:hAnsi="Times New Roman" w:cs="Times New Roman"/>
-          <w:b/>
-          <w:bCs/>
+          <w:b w:val="1"/>
+          <w:bCs w:val="1"/>
           <w:sz w:val="32"/>
           <w:szCs w:val="32"/>
         </w:rPr>
@@ -37,8 +37,8 @@
       <w:r>
         <w:rPr>
           <w:rFonts w:ascii="Times New Roman" w:hAnsi="Times New Roman" w:cs="Times New Roman"/>
-          <w:b/>
-          <w:bCs/>
+          <w:b w:val="1"/>
+          <w:bCs w:val="1"/>
           <w:sz w:val="32"/>
           <w:szCs w:val="32"/>
         </w:rPr>
@@ -47,8 +47,8 @@
       <w:r>
         <w:rPr>
           <w:rFonts w:ascii="Times New Roman" w:hAnsi="Times New Roman" w:cs="Times New Roman"/>
-          <w:b/>
-          <w:bCs/>
+          <w:b w:val="1"/>
+          <w:bCs w:val="1"/>
           <w:sz w:val="32"/>
           <w:szCs w:val="32"/>
         </w:rPr>
@@ -57,8 +57,8 @@
       <w:r>
         <w:rPr>
           <w:rFonts w:ascii="Times New Roman" w:hAnsi="Times New Roman" w:cs="Times New Roman"/>
-          <w:b/>
-          <w:bCs/>
+          <w:b w:val="1"/>
+          <w:bCs w:val="1"/>
           <w:sz w:val="32"/>
           <w:szCs w:val="32"/>
         </w:rPr>
@@ -67,8 +67,8 @@
       <w:r>
         <w:rPr>
           <w:rFonts w:ascii="Times New Roman" w:hAnsi="Times New Roman" w:cs="Times New Roman"/>
-          <w:b/>
-          <w:bCs/>
+          <w:b w:val="1"/>
+          <w:bCs w:val="1"/>
           <w:sz w:val="32"/>
           <w:szCs w:val="32"/>
         </w:rPr>
@@ -77,8 +77,8 @@
       <w:r>
         <w:rPr>
           <w:rFonts w:ascii="Times New Roman" w:hAnsi="Times New Roman" w:cs="Times New Roman"/>
-          <w:b/>
-          <w:bCs/>
+          <w:b w:val="1"/>
+          <w:bCs w:val="1"/>
           <w:sz w:val="32"/>
           <w:szCs w:val="32"/>
         </w:rPr>
@@ -87,8 +87,8 @@
       <w:r>
         <w:rPr>
           <w:rFonts w:ascii="Times New Roman" w:hAnsi="Times New Roman" w:cs="Times New Roman"/>
-          <w:b/>
-          <w:bCs/>
+          <w:b w:val="1"/>
+          <w:bCs w:val="1"/>
           <w:sz w:val="32"/>
           <w:szCs w:val="32"/>
         </w:rPr>
@@ -97,8 +97,8 @@
       <w:r>
         <w:rPr>
           <w:rFonts w:ascii="Times New Roman" w:hAnsi="Times New Roman" w:cs="Times New Roman"/>
-          <w:b/>
-          <w:bCs/>
+          <w:b w:val="1"/>
+          <w:bCs w:val="1"/>
           <w:sz w:val="32"/>
           <w:szCs w:val="32"/>
         </w:rPr>
@@ -107,18 +107,18 @@
       <w:r>
         <w:rPr>
           <w:rFonts w:ascii="Times New Roman" w:hAnsi="Times New Roman" w:cs="Times New Roman"/>
-          <w:b/>
-          <w:bCs/>
+          <w:b w:val="1"/>
+          <w:bCs w:val="1"/>
           <w:sz w:val="32"/>
           <w:szCs w:val="32"/>
         </w:rPr>
-        <w:t>_</w:t>
-      </w:r>
-      <w:r>
-        <w:rPr>
-          <w:rFonts w:ascii="Times New Roman" w:hAnsi="Times New Roman" w:cs="Times New Roman"/>
-          <w:b/>
-          <w:bCs/>
+        <w:t>-</w:t>
+      </w:r>
+      <w:r>
+        <w:rPr>
+          <w:rFonts w:ascii="Times New Roman" w:hAnsi="Times New Roman" w:cs="Times New Roman"/>
+          <w:b w:val="1"/>
+          <w:bCs w:val="1"/>
           <w:sz w:val="32"/>
           <w:szCs w:val="32"/>
         </w:rPr>
@@ -127,8 +127,8 @@
       <w:r>
         <w:rPr>
           <w:rFonts w:ascii="Times New Roman" w:hAnsi="Times New Roman" w:cs="Times New Roman"/>
-          <w:b/>
-          <w:bCs/>
+          <w:b w:val="1"/>
+          <w:bCs w:val="1"/>
           <w:sz w:val="32"/>
           <w:szCs w:val="32"/>
         </w:rPr>
@@ -193,72 +193,88 @@
       <w:r>
         <w:rPr>
           <w:rFonts w:ascii="Times New Roman" w:hAnsi="Times New Roman" w:cs="Times New Roman"/>
-          <w:b/>
-          <w:bCs/>
+          <w:b w:val="1"/>
+          <w:bCs w:val="1"/>
         </w:rPr>
         <w:t>c</w:t>
       </w:r>
       <w:r>
         <w:rPr>
           <w:rFonts w:ascii="Times New Roman" w:hAnsi="Times New Roman" w:cs="Times New Roman"/>
-          <w:b/>
-          <w:bCs/>
+          <w:b w:val="1"/>
+          <w:bCs w:val="1"/>
         </w:rPr>
         <w:t>lient</w:t>
       </w:r>
       <w:r>
         <w:rPr>
           <w:rFonts w:ascii="Times New Roman" w:hAnsi="Times New Roman" w:cs="Times New Roman"/>
-          <w:b/>
-          <w:bCs/>
+          <w:b w:val="1"/>
+          <w:bCs w:val="1"/>
         </w:rPr>
         <w:t>_c</w:t>
       </w:r>
       <w:r>
         <w:rPr>
           <w:rFonts w:ascii="Times New Roman" w:hAnsi="Times New Roman" w:cs="Times New Roman"/>
-          <w:b/>
-          <w:bCs/>
+          <w:b w:val="1"/>
+          <w:bCs w:val="1"/>
         </w:rPr>
         <w:t>all</w:t>
       </w:r>
       <w:r>
         <w:rPr>
           <w:rFonts w:ascii="Times New Roman" w:hAnsi="Times New Roman" w:cs="Times New Roman"/>
-          <w:b/>
-          <w:bCs/>
+          <w:b w:val="1"/>
+          <w:bCs w:val="1"/>
         </w:rPr>
         <w:t>_u</w:t>
       </w:r>
       <w:r>
         <w:rPr>
           <w:rFonts w:ascii="Times New Roman" w:hAnsi="Times New Roman" w:cs="Times New Roman"/>
-          <w:b/>
-          <w:bCs/>
+          <w:b w:val="1"/>
+          <w:bCs w:val="1"/>
         </w:rPr>
         <w:t>pdate</w:t>
       </w:r>
       <w:r>
         <w:rPr>
           <w:rFonts w:ascii="Times New Roman" w:hAnsi="Times New Roman" w:cs="Times New Roman"/>
-          <w:b/>
-          <w:bCs/>
-        </w:rPr>
-        <w:t>-generation</w:t>
-      </w:r>
-      <w:r>
-        <w:rPr>
-          <w:rFonts w:ascii="Times New Roman" w:hAnsi="Times New Roman" w:cs="Times New Roman"/>
-          <w:b/>
-          <w:bCs/>
-        </w:rPr>
-        <w:t>_skill</w:t>
-      </w:r>
-      <w:r>
-        <w:rPr>
-          <w:rFonts w:ascii="Times New Roman" w:hAnsi="Times New Roman" w:cs="Times New Roman"/>
-          <w:b/>
-          <w:bCs/>
+          <w:b w:val="1"/>
+          <w:bCs w:val="1"/>
+        </w:rPr>
+        <w:t>_</w:t>
+      </w:r>
+      <w:r>
+        <w:rPr>
+          <w:rFonts w:ascii="Times New Roman" w:hAnsi="Times New Roman" w:cs="Times New Roman"/>
+          <w:b w:val="1"/>
+          <w:bCs w:val="1"/>
+        </w:rPr>
+        <w:t>generation</w:t>
+      </w:r>
+      <w:r>
+        <w:rPr>
+          <w:rFonts w:ascii="Times New Roman" w:hAnsi="Times New Roman" w:cs="Times New Roman"/>
+          <w:b w:val="1"/>
+          <w:bCs w:val="1"/>
+        </w:rPr>
+        <w:t>-</w:t>
+      </w:r>
+      <w:r>
+        <w:rPr>
+          <w:rFonts w:ascii="Times New Roman" w:hAnsi="Times New Roman" w:cs="Times New Roman"/>
+          <w:b w:val="1"/>
+          <w:bCs w:val="1"/>
+        </w:rPr>
+        <w:t>skill</w:t>
+      </w:r>
+      <w:r>
+        <w:rPr>
+          <w:rFonts w:ascii="Times New Roman" w:hAnsi="Times New Roman" w:cs="Times New Roman"/>
+          <w:b w:val="1"/>
+          <w:bCs w:val="1"/>
         </w:rPr>
         <w:t xml:space="preserve"> </w:t>
       </w:r>
@@ -266,7 +282,19 @@
         <w:rPr>
           <w:rFonts w:ascii="Times New Roman" w:hAnsi="Times New Roman" w:cs="Times New Roman"/>
         </w:rPr>
-        <w:t>is an AI-powered skill designed to help Project Managers prepare for client status meetings. It automatically collects project information from Meldep ERP tools, analyzes completed work, planned activities, requirements, and task progress, then generates structured client-call talking points.</w:t>
+        <w:t xml:space="preserve">is an AI-powered skill designed to help Project Managers prepare for client status meetings. It automatically collects project information from </w:t>
+      </w:r>
+      <w:r>
+        <w:rPr>
+          <w:rFonts w:ascii="Times New Roman" w:hAnsi="Times New Roman" w:cs="Times New Roman"/>
+        </w:rPr>
+        <w:t>Meldep</w:t>
+      </w:r>
+      <w:r>
+        <w:rPr>
+          <w:rFonts w:ascii="Times New Roman" w:hAnsi="Times New Roman" w:cs="Times New Roman"/>
+        </w:rPr>
+        <w:t xml:space="preserve"> ERP tools, analyzes completed work, planned activities, requirements, and task progress, then generates structured client-call talking points.</w:t>
       </w:r>
     </w:p>
     <w:p>
@@ -627,6 +655,7 @@
         <w:tc>
           <w:tcPr>
             <w:tcW w:w="3865" w:type="dxa"/>
+            <w:tcMar/>
           </w:tcPr>
           <w:p>
             <w:pPr>
@@ -648,6 +677,7 @@
         <w:tc>
           <w:tcPr>
             <w:tcW w:w="6879" w:type="dxa"/>
+            <w:tcMar/>
           </w:tcPr>
           <w:p>
             <w:pPr>
@@ -671,6 +701,7 @@
         <w:tc>
           <w:tcPr>
             <w:tcW w:w="3865" w:type="dxa"/>
+            <w:tcMar/>
             <w:vAlign w:val="center"/>
           </w:tcPr>
           <w:p>
@@ -691,6 +722,7 @@
         <w:tc>
           <w:tcPr>
             <w:tcW w:w="6879" w:type="dxa"/>
+            <w:tcMar/>
           </w:tcPr>
           <w:p>
             <w:pPr>
@@ -712,6 +744,7 @@
         <w:tc>
           <w:tcPr>
             <w:tcW w:w="3865" w:type="dxa"/>
+            <w:tcMar/>
           </w:tcPr>
           <w:p>
             <w:pPr>
@@ -731,6 +764,7 @@
         <w:tc>
           <w:tcPr>
             <w:tcW w:w="6879" w:type="dxa"/>
+            <w:tcMar/>
             <w:vAlign w:val="center"/>
           </w:tcPr>
           <w:p>
@@ -753,6 +787,7 @@
         <w:tc>
           <w:tcPr>
             <w:tcW w:w="3865" w:type="dxa"/>
+            <w:tcMar/>
           </w:tcPr>
           <w:p>
             <w:pPr>
@@ -772,6 +807,7 @@
         <w:tc>
           <w:tcPr>
             <w:tcW w:w="6879" w:type="dxa"/>
+            <w:tcMar/>
           </w:tcPr>
           <w:p>
             <w:pPr>
@@ -793,25 +829,24 @@
         <w:tc>
           <w:tcPr>
             <w:tcW w:w="3865" w:type="dxa"/>
+            <w:tcMar/>
           </w:tcPr>
           <w:p>
             <w:pPr>
               <w:spacing w:line="360" w:lineRule="auto"/>
-              <w:rPr>
-                <w:rFonts w:ascii="Times New Roman" w:hAnsi="Times New Roman" w:cs="Times New Roman"/>
-              </w:rPr>
             </w:pPr>
             <w:r>
               <w:rPr>
                 <w:rFonts w:ascii="Times New Roman" w:hAnsi="Times New Roman" w:cs="Times New Roman"/>
               </w:rPr>
-              <w:t>get_all_requirements_by_project</w:t>
+              <w:t>get_requirements</w:t>
             </w:r>
           </w:p>
         </w:tc>
         <w:tc>
           <w:tcPr>
             <w:tcW w:w="6879" w:type="dxa"/>
+            <w:tcMar/>
           </w:tcPr>
           <w:p>
             <w:pPr>
@@ -836,6 +871,7 @@
         <w:tc>
           <w:tcPr>
             <w:tcW w:w="3865" w:type="dxa"/>
+            <w:tcMar/>
           </w:tcPr>
           <w:p>
             <w:pPr>
@@ -855,6 +891,7 @@
         <w:tc>
           <w:tcPr>
             <w:tcW w:w="6879" w:type="dxa"/>
+            <w:tcMar/>
           </w:tcPr>
           <w:p>
             <w:pPr>
@@ -1052,7 +1089,6 @@
               <w:rPr>
                 <w:rFonts w:ascii="Times New Roman" w:hAnsi="Times New Roman" w:cs="Times New Roman"/>
               </w:rPr>
-              <w:lastRenderedPageBreak/>
               <w:t>/projects/get-project-weekly-plan-details</w:t>
             </w:r>
           </w:p>
@@ -2277,7 +2313,7 @@
 </file>
 
 <file path=word/styles.xml><?xml version="1.0" encoding="utf-8"?>
-<w:styles xmlns:mc="http://schemas.openxmlformats.org/markup-compatibility/2006" xmlns:r="http://schemas.openxmlformats.org/officeDocument/2006/relationships" xmlns:w="http://schemas.openxmlformats.org/wordprocessingml/2006/main" xmlns:w14="http://schemas.microsoft.com/office/word/2010/wordml" xmlns:w15="http://schemas.microsoft.com/office/word/2012/wordml" xmlns:w16cex="http://schemas.microsoft.com/office/word/2018/wordml/cex" xmlns:w16cid="http://schemas.microsoft.com/office/word/2016/wordml/cid" xmlns:w16="http://schemas.microsoft.com/office/word/2018/wordml" xmlns:w16du="http://schemas.microsoft.com/office/word/2023/wordml/word16du" xmlns:w16sdtdh="http://schemas.microsoft.com/office/word/2020/wordml/sdtdatahash" xmlns:w16sdtfl="http://schemas.microsoft.com/office/word/2024/wordml/sdtformatlock" xmlns:w16se="http://schemas.microsoft.com/office/word/2015/wordml/symex" mc:Ignorable="w14 w15 w16se w16cid w16 w16cex w16sdtdh w16sdtfl w16du">
+<w:styles xmlns:wp14="http://schemas.microsoft.com/office/word/2010/wordprocessingDrawing" xmlns:mc="http://schemas.openxmlformats.org/markup-compatibility/2006" xmlns:r="http://schemas.openxmlformats.org/officeDocument/2006/relationships" xmlns:w="http://schemas.openxmlformats.org/wordprocessingml/2006/main" xmlns:w14="http://schemas.microsoft.com/office/word/2010/wordml" xmlns:w15="http://schemas.microsoft.com/office/word/2012/wordml" xmlns:w16cex="http://schemas.microsoft.com/office/word/2018/wordml/cex" xmlns:w16cid="http://schemas.microsoft.com/office/word/2016/wordml/cid" xmlns:w16="http://schemas.microsoft.com/office/word/2018/wordml" xmlns:w16du="http://schemas.microsoft.com/office/word/2023/wordml/word16du" xmlns:w16sdtdh="http://schemas.microsoft.com/office/word/2020/wordml/sdtdatahash" xmlns:w16sdtfl="http://schemas.microsoft.com/office/word/2024/wordml/sdtformatlock" xmlns:w16se="http://schemas.microsoft.com/office/word/2015/wordml/symex" mc:Ignorable="w14 w15 w16se w16cid w16 w16cex w16sdtdh w16sdtfl w16du wp14">
   <w:docDefaults>
     <w:rPrDefault>
       <w:rPr>

</xml_diff>